<commit_message>
barlow: strip front-matter from all proposal variants + formal 6-pp trim pass
Program metadata (division/deadline/roles/award) removed from all three S/T/M
variants; now lives only in barlow/README.md. Formal variant trimmed 8->7 pp
rendered (~6 pp content excl. references): table cells + figure captions
compressed, QC anecdotes cut. finesst_proposal.docx re-render pending (file
locked in Word).

Co-Authored-By: Claude Fable 5 <noreply@anthropic.com>
</commit_message>
<xml_diff>
--- a/barlow/docs/finesst_proposal_basic.docx
+++ b/barlow/docs/finesst_proposal_basic.docx
@@ -11,59 +11,6 @@
           <w:sz w:val="36"/>
         </w:rPr>
         <w:t>Measuring and Explaining Stream-Channel Change in the McMurdo Dry Valleys, Antarctica</w:t>
-      </w:r>
-    </w:p>
-    <w:p>
-      <w:pPr>
-        <w:spacing w:after="160"/>
-        <w:jc w:val="center"/>
-      </w:pPr>
-      <w:r>
-        <w:rPr>
-          <w:rFonts w:ascii="Calibri" w:hAnsi="Calibri"/>
-          <w:b w:val="0"/>
-          <w:i/>
-          <w:color w:val="666666"/>
-          <w:sz w:val="18"/>
-        </w:rPr>
-        <w:t>NASA ROSES F.5: Future Investigators in NASA Earth and Space Science and Technology (FINESST)</w:t>
-      </w:r>
-    </w:p>
-    <w:p>
-      <w:pPr>
-        <w:spacing w:after="120"/>
-      </w:pPr>
-      <w:r>
-        <w:rPr>
-          <w:rFonts w:ascii="Calibri" w:hAnsi="Calibri"/>
-          <w:b w:val="0"/>
-          <w:i w:val="0"/>
-        </w:rPr>
-        <w:t>Target division:</w:t>
-      </w:r>
-      <w:r>
-        <w:rPr>
-          <w:rFonts w:ascii="Calibri" w:hAnsi="Calibri"/>
-          <w:b w:val="0"/>
-          <w:i w:val="0"/>
-        </w:rPr>
-        <w:t xml:space="preserve"> Earth Science Division — Antarctic cryosphere / climate </w:t>
-      </w:r>
-      <w:r>
-        <w:rPr>
-          <w:rFonts w:ascii="Calibri" w:hAnsi="Calibri"/>
-          <w:b w:val="0"/>
-          <w:i w:val="0"/>
-        </w:rPr>
-        <w:t>Structure:</w:t>
-      </w:r>
-      <w:r>
-        <w:rPr>
-          <w:rFonts w:ascii="Calibri" w:hAnsi="Calibri"/>
-          <w:b w:val="0"/>
-          <w:i w:val="0"/>
-        </w:rPr>
-        <w:t xml:space="preserve"> Graduate student = Future Investigator (FI), intellectual lead and primary author; faculty advisor = PI of record. Award up to ~$50,000/yr for up to 3 years.</w:t>
       </w:r>
     </w:p>
     <w:p>

</xml_diff>